<commit_message>
docs: align ERP migration test summary with case register
</commit_message>
<xml_diff>
--- a/Project-ERP-Implementation-Consultant/docs/Week3_Data_Migration_and_Integration_Testing.docx
+++ b/Project-ERP-Implementation-Consultant/docs/Week3_Data_Migration_and_Integration_Testing.docx
@@ -649,7 +649,7 @@
                 <w:color w:val="263238"/>
                 <w:sz w:val="16"/>
               </w:rPr>
-              <w:t>Create PO for approved supplier/material; route approval; post receipt against PO.</w:t>
+              <w:t>Create PO for approved supplier/material; post receipt against PO.</w:t>
             </w:r>
           </w:p>
         </w:tc>
@@ -670,7 +670,7 @@
                 <w:color w:val="263238"/>
                 <w:sz w:val="16"/>
               </w:rPr>
-              <w:t>3 tests pass.</w:t>
+              <w:t>2 tests pass.</w:t>
             </w:r>
           </w:p>
         </w:tc>
@@ -691,7 +691,7 @@
                 <w:color w:val="263238"/>
                 <w:sz w:val="16"/>
               </w:rPr>
-              <w:t>Receipt retains PO reference, material and UOM; role separation is verified.</w:t>
+              <w:t>Receipt retains PO reference, material and UOM.</w:t>
             </w:r>
           </w:p>
         </w:tc>
@@ -759,7 +759,7 @@
                 <w:color w:val="263238"/>
                 <w:sz w:val="16"/>
               </w:rPr>
-              <w:t>One unit mapping and one blank target unit fail; duplicate is held.</w:t>
+              <w:t>One duplicate check passes; two seeded unit/balance exceptions fail.</w:t>
             </w:r>
           </w:p>
         </w:tc>
@@ -846,7 +846,7 @@
                 <w:color w:val="263238"/>
                 <w:sz w:val="16"/>
               </w:rPr>
-              <w:t>3 tests pass.</w:t>
+              <w:t>4 tests pass.</w:t>
             </w:r>
           </w:p>
         </w:tc>
@@ -935,7 +935,7 @@
                 <w:color w:val="263238"/>
                 <w:sz w:val="16"/>
               </w:rPr>
-              <w:t>2 tests pass.</w:t>
+              <w:t>1 test passes.</w:t>
             </w:r>
           </w:p>
         </w:tc>

</xml_diff>